<commit_message>
docs(seguridad): anonimizar identificadores del proyecto en la documentacion
Se retiran de los documentos publicados los datos que permitian identificar el
proyecto y las cuentas de prueba (huella cero).

- sigvach26-bd -> TU-PROYECTO-FIREBASE.
- bo.edu.uajms.sigvach -> tu.paquete.app (solo en documentos; se conserva en el
  codigo Android porque es el applicationId real y es funcional).
- Correos de prueba anonimizados (admin@tudominio.com, usuario1/2@tudominio.com) y
  eliminado tecnico@gmail.com, que era un correo real.
- Eliminada la contrasena de prueba "Prueba123456" de la guia.
- Sustituido el nombre real "Lucio Navarro" de la bitacora.
- Regenerados los .docx con scripts/md_a_docx.py.

Afecta a docs/07_FIRESTORE.md, docs/08_INFORME_DE_CAMBIOS.md y
docs/BITACORA_MARTES_2026-09-08.md mas sus versiones .docx.
</commit_message>
<xml_diff>
--- a/docs/08_INFORME_DE_CAMBIOS.docx
+++ b/docs/08_INFORME_DE_CAMBIOS.docx
@@ -1474,7 +1474,7 @@
         </w:rPr>
         <w:t>usuarios/{uid}</w:t>
         <w:br/>
-        <w:t>├── email:      "operador1@sigvach.com"</w:t>
+        <w:t>├── email:      "usuario1@tudominio.com"</w:t>
         <w:br/>
         <w:t>├── nombre:     "Operador Uno"</w:t>
         <w:br/>
@@ -1942,7 +1942,7 @@
                 <w:b w:val="0"/>
                 <w:sz w:val="20"/>
               </w:rPr>
-              <w:t>Rol admin asignado automáticamente al correo admin@sigvach.com; el resto es usuario</w:t>
+              <w:t>Rol admin asignado automáticamente al correo admin@tudominio.com; el resto es usuario</w:t>
             </w:r>
           </w:p>
         </w:tc>

</xml_diff>